<commit_message>
End of day progress on CS:APP notes
</commit_message>
<xml_diff>
--- a/notes.docx
+++ b/notes.docx
@@ -4,6 +4,14 @@
   <w:body>
     <w:sdt>
       <w:sdtPr>
+        <w:rPr>
+          <w:rFonts w:asciiTheme="minorHAnsi" w:eastAsiaTheme="minorHAnsi" w:hAnsiTheme="minorHAnsi" w:cstheme="minorBidi"/>
+          <w:color w:val="auto"/>
+          <w:kern w:val="2"/>
+          <w:sz w:val="24"/>
+          <w:szCs w:val="24"/>
+          <w14:ligatures w14:val="standardContextual"/>
+        </w:rPr>
         <w:id w:val="-133023484"/>
         <w:docPartObj>
           <w:docPartGallery w:val="Table of Contents"/>
@@ -12,15 +20,9 @@
       </w:sdtPr>
       <w:sdtEndPr>
         <w:rPr>
-          <w:rFonts w:asciiTheme="minorHAnsi" w:eastAsiaTheme="minorHAnsi" w:hAnsiTheme="minorHAnsi" w:cstheme="minorBidi"/>
           <w:b/>
           <w:bCs/>
           <w:noProof/>
-          <w:color w:val="auto"/>
-          <w:kern w:val="2"/>
-          <w:sz w:val="24"/>
-          <w:szCs w:val="24"/>
-          <w14:ligatures w14:val="standardContextual"/>
         </w:rPr>
       </w:sdtEndPr>
       <w:sdtContent>
@@ -39,6 +41,7 @@
               <w:tab w:val="right" w:leader="dot" w:pos="10790"/>
             </w:tabs>
             <w:rPr>
+              <w:rFonts w:eastAsiaTheme="minorEastAsia"/>
               <w:noProof/>
             </w:rPr>
           </w:pPr>
@@ -51,7 +54,7 @@
           <w:r>
             <w:fldChar w:fldCharType="separate"/>
           </w:r>
-          <w:hyperlink w:anchor="_Toc227785954" w:history="1">
+          <w:hyperlink w:anchor="_Toc227946136" w:history="1">
             <w:r>
               <w:rPr>
                 <w:rStyle w:val="Hyperlink"/>
@@ -78,7 +81,7 @@
                 <w:noProof/>
                 <w:webHidden/>
               </w:rPr>
-              <w:instrText xml:space="preserve"> PAGEREF _Toc227785954 \h </w:instrText>
+              <w:instrText xml:space="preserve"> PAGEREF _Toc227946136 \h </w:instrText>
             </w:r>
             <w:r>
               <w:rPr>
@@ -98,7 +101,7 @@
                 <w:noProof/>
                 <w:webHidden/>
               </w:rPr>
-              <w:t>1</w:t>
+              <w:t>2</w:t>
             </w:r>
             <w:r>
               <w:rPr>
@@ -116,10 +119,11 @@
               <w:tab w:val="right" w:leader="dot" w:pos="10790"/>
             </w:tabs>
             <w:rPr>
+              <w:rFonts w:eastAsiaTheme="minorEastAsia"/>
               <w:noProof/>
             </w:rPr>
           </w:pPr>
-          <w:hyperlink w:anchor="_Toc227785955" w:history="1">
+          <w:hyperlink w:anchor="_Toc227946137" w:history="1">
             <w:r>
               <w:rPr>
                 <w:rStyle w:val="Hyperlink"/>
@@ -146,7 +150,7 @@
                 <w:noProof/>
                 <w:webHidden/>
               </w:rPr>
-              <w:instrText xml:space="preserve"> PAGEREF _Toc227785955 \h </w:instrText>
+              <w:instrText xml:space="preserve"> PAGEREF _Toc227946137 \h </w:instrText>
             </w:r>
             <w:r>
               <w:rPr>
@@ -166,7 +170,7 @@
                 <w:noProof/>
                 <w:webHidden/>
               </w:rPr>
-              <w:t>1</w:t>
+              <w:t>2</w:t>
             </w:r>
             <w:r>
               <w:rPr>
@@ -184,10 +188,11 @@
               <w:tab w:val="right" w:leader="dot" w:pos="10790"/>
             </w:tabs>
             <w:rPr>
+              <w:rFonts w:eastAsiaTheme="minorEastAsia"/>
               <w:noProof/>
             </w:rPr>
           </w:pPr>
-          <w:hyperlink w:anchor="_Toc227785956" w:history="1">
+          <w:hyperlink w:anchor="_Toc227946138" w:history="1">
             <w:r>
               <w:rPr>
                 <w:rStyle w:val="Hyperlink"/>
@@ -214,7 +219,7 @@
                 <w:noProof/>
                 <w:webHidden/>
               </w:rPr>
-              <w:instrText xml:space="preserve"> PAGEREF _Toc227785956 \h </w:instrText>
+              <w:instrText xml:space="preserve"> PAGEREF _Toc227946138 \h </w:instrText>
             </w:r>
             <w:r>
               <w:rPr>
@@ -234,7 +239,145 @@
                 <w:noProof/>
                 <w:webHidden/>
               </w:rPr>
-              <w:t>2</w:t>
+              <w:t>3</w:t>
+            </w:r>
+            <w:r>
+              <w:rPr>
+                <w:noProof/>
+                <w:webHidden/>
+              </w:rPr>
+              <w:fldChar w:fldCharType="end"/>
+            </w:r>
+          </w:hyperlink>
+        </w:p>
+        <w:p>
+          <w:pPr>
+            <w:pStyle w:val="TOC2"/>
+            <w:tabs>
+              <w:tab w:val="right" w:leader="dot" w:pos="10790"/>
+            </w:tabs>
+            <w:rPr>
+              <w:rFonts w:eastAsiaTheme="minorEastAsia"/>
+              <w:noProof/>
+            </w:rPr>
+          </w:pPr>
+          <w:hyperlink w:anchor="_Toc227946139" w:history="1">
+            <w:r>
+              <w:rPr>
+                <w:rStyle w:val="Hyperlink"/>
+                <w:noProof/>
+              </w:rPr>
+              <w:t>The Operating System Manages the Hardware</w:t>
+            </w:r>
+            <w:r>
+              <w:rPr>
+                <w:noProof/>
+                <w:webHidden/>
+              </w:rPr>
+              <w:tab/>
+            </w:r>
+            <w:r>
+              <w:rPr>
+                <w:noProof/>
+                <w:webHidden/>
+              </w:rPr>
+              <w:fldChar w:fldCharType="begin"/>
+            </w:r>
+            <w:r>
+              <w:rPr>
+                <w:noProof/>
+                <w:webHidden/>
+              </w:rPr>
+              <w:instrText xml:space="preserve"> PAGEREF _Toc227946139 \h </w:instrText>
+            </w:r>
+            <w:r>
+              <w:rPr>
+                <w:noProof/>
+                <w:webHidden/>
+              </w:rPr>
+            </w:r>
+            <w:r>
+              <w:rPr>
+                <w:noProof/>
+                <w:webHidden/>
+              </w:rPr>
+              <w:fldChar w:fldCharType="separate"/>
+            </w:r>
+            <w:r>
+              <w:rPr>
+                <w:noProof/>
+                <w:webHidden/>
+              </w:rPr>
+              <w:t>4</w:t>
+            </w:r>
+            <w:r>
+              <w:rPr>
+                <w:noProof/>
+                <w:webHidden/>
+              </w:rPr>
+              <w:fldChar w:fldCharType="end"/>
+            </w:r>
+          </w:hyperlink>
+        </w:p>
+        <w:p>
+          <w:pPr>
+            <w:pStyle w:val="TOC2"/>
+            <w:tabs>
+              <w:tab w:val="right" w:leader="dot" w:pos="10790"/>
+            </w:tabs>
+            <w:rPr>
+              <w:rFonts w:eastAsiaTheme="minorEastAsia"/>
+              <w:noProof/>
+            </w:rPr>
+          </w:pPr>
+          <w:hyperlink w:anchor="_Toc227946140" w:history="1">
+            <w:r>
+              <w:rPr>
+                <w:rStyle w:val="Hyperlink"/>
+                <w:noProof/>
+              </w:rPr>
+              <w:t>Concurrency and Parallelism</w:t>
+            </w:r>
+            <w:r>
+              <w:rPr>
+                <w:noProof/>
+                <w:webHidden/>
+              </w:rPr>
+              <w:tab/>
+            </w:r>
+            <w:r>
+              <w:rPr>
+                <w:noProof/>
+                <w:webHidden/>
+              </w:rPr>
+              <w:fldChar w:fldCharType="begin"/>
+            </w:r>
+            <w:r>
+              <w:rPr>
+                <w:noProof/>
+                <w:webHidden/>
+              </w:rPr>
+              <w:instrText xml:space="preserve"> PAGEREF _Toc227946140 \h </w:instrText>
+            </w:r>
+            <w:r>
+              <w:rPr>
+                <w:noProof/>
+                <w:webHidden/>
+              </w:rPr>
+            </w:r>
+            <w:r>
+              <w:rPr>
+                <w:noProof/>
+                <w:webHidden/>
+              </w:rPr>
+              <w:fldChar w:fldCharType="separate"/>
+            </w:r>
+            <w:r>
+              <w:rPr>
+                <w:noProof/>
+                <w:webHidden/>
+              </w:rPr>
+              <w:t>5</w:t>
             </w:r>
             <w:r>
               <w:rPr>
@@ -267,7 +410,7 @@
       <w:pPr>
         <w:pStyle w:val="Heading1"/>
       </w:pPr>
-      <w:bookmarkStart w:id="0" w:name="_Toc227785954"/>
+      <w:bookmarkStart w:id="0" w:name="_Toc227946136"/>
       <w:r>
         <w:t>Chapter 1: A Tour of Computer Systems</w:t>
       </w:r>
@@ -277,7 +420,7 @@
       <w:pPr>
         <w:pStyle w:val="Heading2"/>
       </w:pPr>
-      <w:bookmarkStart w:id="1" w:name="_Toc227785955"/>
+      <w:bookmarkStart w:id="1" w:name="_Toc227946137"/>
       <w:r>
         <w:t>The Compilation System</w:t>
       </w:r>
@@ -288,6 +431,9 @@
         <w:jc w:val="center"/>
       </w:pPr>
       <w:r>
+        <w:rPr>
+          <w:noProof/>
+        </w:rPr>
         <w:drawing>
           <wp:inline distT="0" distB="0" distL="0" distR="0" wp14:anchorId="4DE3CB72" wp14:editId="7C46FA8F">
             <wp:extent cx="5943600" cy="1903730"/>
@@ -330,6 +476,9 @@
         <w:jc w:val="center"/>
       </w:pPr>
       <w:r>
+        <w:rPr>
+          <w:noProof/>
+        </w:rPr>
         <w:drawing>
           <wp:inline distT="0" distB="0" distL="0" distR="0" wp14:anchorId="5AA4D077" wp14:editId="0B97E26A">
             <wp:extent cx="5943600" cy="1605280"/>
@@ -407,7 +556,15 @@
               <w:jc w:val="center"/>
             </w:pPr>
             <w:r>
-              <w:t>Modifies the original C program according to directives that begin with the ‘#’ character. Result is another C program with the .i suffix.</w:t>
+              <w:t>Modifies the original C program according to directives that begin with the ‘#’ character. Result is another C program with the .</w:t>
+            </w:r>
+            <w:proofErr w:type="spellStart"/>
+            <w:r>
+              <w:t>i</w:t>
+            </w:r>
+            <w:proofErr w:type="spellEnd"/>
+            <w:r>
+              <w:t xml:space="preserve"> suffix.</w:t>
             </w:r>
           </w:p>
         </w:tc>
@@ -509,7 +666,31 @@
               <w:jc w:val="center"/>
             </w:pPr>
             <w:r>
-              <w:t>Notice that the hello program calls the printf function, which is part of the standard C library of every compiler. The printf function resides in a separate precompiled object file called printf.o, which must somehow be merged with our hello.o program. The linker (ld) handles this merging. The result is an executable object file.</w:t>
+              <w:t xml:space="preserve">Notice that the </w:t>
+            </w:r>
+            <w:proofErr w:type="gramStart"/>
+            <w:r>
+              <w:t>hello</w:t>
+            </w:r>
+            <w:proofErr w:type="gramEnd"/>
+            <w:r>
+              <w:t xml:space="preserve"> program calls the printf function, which is part of the standard C library of every compiler. The printf function resides in a separate precompiled object file called </w:t>
+            </w:r>
+            <w:proofErr w:type="spellStart"/>
+            <w:r>
+              <w:t>printf.o</w:t>
+            </w:r>
+            <w:proofErr w:type="spellEnd"/>
+            <w:r>
+              <w:t>, which must somehow be merged with our hello.o program. The linker (</w:t>
+            </w:r>
+            <w:proofErr w:type="spellStart"/>
+            <w:r>
+              <w:t>ld</w:t>
+            </w:r>
+            <w:proofErr w:type="spellEnd"/>
+            <w:r>
+              <w:t>) handles this merging. The result is an executable object file.</w:t>
             </w:r>
           </w:p>
         </w:tc>
@@ -612,7 +793,7 @@
       <w:pPr>
         <w:pStyle w:val="Heading2"/>
       </w:pPr>
-      <w:bookmarkStart w:id="2" w:name="_Toc227785956"/>
+      <w:bookmarkStart w:id="2" w:name="_Toc227946138"/>
       <w:r>
         <w:t>Hardware Organization of a System</w:t>
       </w:r>
@@ -620,6 +801,9 @@
     </w:p>
     <w:p>
       <w:r>
+        <w:rPr>
+          <w:noProof/>
+        </w:rPr>
         <w:drawing>
           <wp:inline distT="0" distB="0" distL="0" distR="0" wp14:anchorId="7790F08E" wp14:editId="7ED3FA34">
             <wp:extent cx="5285539" cy="3686175"/>
@@ -880,6 +1064,9 @@
               <w:jc w:val="center"/>
             </w:pPr>
             <w:r>
+              <w:rPr>
+                <w:noProof/>
+              </w:rPr>
               <w:drawing>
                 <wp:inline distT="0" distB="0" distL="0" distR="0" wp14:anchorId="4C0261C0" wp14:editId="3409FF7E">
                   <wp:extent cx="3273444" cy="2417196"/>
@@ -923,7 +1110,23 @@
               <w:jc w:val="center"/>
             </w:pPr>
             <w:r>
-              <w:t>1) As we type the characters ./hello at the keyboard, the shell program reads each one into a register and then stores it in Main Memory. Hello executable is then stored in the Disk.</w:t>
+              <w:t xml:space="preserve">1) As we type the characters ./hello at the keyboard, the shell program reads each one into a register and then stores it in Main Memory. Hello </w:t>
+            </w:r>
+            <w:proofErr w:type="gramStart"/>
+            <w:r>
+              <w:t>executable is</w:t>
+            </w:r>
+            <w:proofErr w:type="gramEnd"/>
+            <w:r>
+              <w:t xml:space="preserve"> then stored </w:t>
+            </w:r>
+            <w:proofErr w:type="gramStart"/>
+            <w:r>
+              <w:t>in</w:t>
+            </w:r>
+            <w:proofErr w:type="gramEnd"/>
+            <w:r>
+              <w:t xml:space="preserve"> the Disk.</w:t>
             </w:r>
           </w:p>
         </w:tc>
@@ -937,6 +1140,9 @@
               <w:jc w:val="center"/>
             </w:pPr>
             <w:r>
+              <w:rPr>
+                <w:noProof/>
+              </w:rPr>
               <w:drawing>
                 <wp:inline distT="0" distB="0" distL="0" distR="0" wp14:anchorId="6C2C6B58" wp14:editId="66A6EE63">
                   <wp:extent cx="3319670" cy="2215572"/>
@@ -999,6 +1205,9 @@
               <w:jc w:val="center"/>
             </w:pPr>
             <w:r>
+              <w:rPr>
+                <w:noProof/>
+              </w:rPr>
               <w:drawing>
                 <wp:inline distT="0" distB="0" distL="0" distR="0" wp14:anchorId="1BCE3670" wp14:editId="7B3E7E4D">
                   <wp:extent cx="3144740" cy="2158806"/>
@@ -1061,6 +1270,9 @@
               <w:jc w:val="center"/>
             </w:pPr>
             <w:r>
+              <w:rPr>
+                <w:noProof/>
+              </w:rPr>
               <w:drawing>
                 <wp:inline distT="0" distB="0" distL="0" distR="0" wp14:anchorId="3823DAB3" wp14:editId="1E9D377D">
                   <wp:extent cx="3294256" cy="2181225"/>
@@ -1105,9 +1317,11 @@
       <w:pPr>
         <w:pStyle w:val="Heading2"/>
       </w:pPr>
+      <w:bookmarkStart w:id="3" w:name="_Toc227946139"/>
       <w:r>
         <w:t>The Operating System Manages the Hardware</w:t>
       </w:r>
+      <w:bookmarkEnd w:id="3"/>
     </w:p>
     <w:p>
       <w:r>
@@ -1116,6 +1330,9 @@
     </w:p>
     <w:p>
       <w:r>
+        <w:rPr>
+          <w:noProof/>
+        </w:rPr>
         <w:lastRenderedPageBreak/>
         <w:drawing>
           <wp:inline distT="0" distB="0" distL="0" distR="0" wp14:anchorId="3E89E960" wp14:editId="70EB5302">
@@ -1187,7 +1404,783 @@
       <w:pPr>
         <w:pStyle w:val="Heading2"/>
       </w:pPr>
+      <w:bookmarkStart w:id="4" w:name="_Toc227946140"/>
+      <w:r>
+        <w:t>Concurrency and Parallelism</w:t>
+      </w:r>
+      <w:bookmarkEnd w:id="4"/>
     </w:p>
+    <w:p>
+      <w:r>
+        <w:t xml:space="preserve">We demand computers </w:t>
+      </w:r>
+      <w:r>
+        <w:t>do</w:t>
+      </w:r>
+      <w:r>
+        <w:t xml:space="preserve"> more, and we want them to run faster. </w:t>
+      </w:r>
+      <w:r>
+        <w:t>Both</w:t>
+      </w:r>
+      <w:r>
+        <w:t xml:space="preserve"> factors improve when the processor does more things at once. We use the term </w:t>
+      </w:r>
+      <w:r>
+        <w:rPr>
+          <w:b/>
+          <w:bCs/>
+          <w:i/>
+          <w:iCs/>
+        </w:rPr>
+        <w:t>Concurrency</w:t>
+      </w:r>
+      <w:r>
+        <w:t xml:space="preserve"> to refer to the general concept of </w:t>
+      </w:r>
+      <w:r>
+        <w:rPr>
+          <w:b/>
+          <w:bCs/>
+        </w:rPr>
+        <w:t>a system with multiple, simultaneous activities</w:t>
+      </w:r>
+      <w:r>
+        <w:t xml:space="preserve">, and the term </w:t>
+      </w:r>
+      <w:r>
+        <w:rPr>
+          <w:b/>
+          <w:bCs/>
+          <w:i/>
+          <w:iCs/>
+        </w:rPr>
+        <w:t>Parallelism</w:t>
+      </w:r>
+      <w:r>
+        <w:t xml:space="preserve"> to refer to </w:t>
+      </w:r>
+      <w:r>
+        <w:rPr>
+          <w:b/>
+          <w:bCs/>
+        </w:rPr>
+        <w:t>the use of concurrency to make a system run faster</w:t>
+      </w:r>
+      <w:r>
+        <w:t>.</w:t>
+      </w:r>
+    </w:p>
+    <w:tbl>
+      <w:tblPr>
+        <w:tblStyle w:val="TableGrid"/>
+        <w:tblW w:w="0" w:type="auto"/>
+        <w:tblLook w:val="04A0" w:firstRow="1" w:lastRow="0" w:firstColumn="1" w:lastColumn="0" w:noHBand="0" w:noVBand="1"/>
+      </w:tblPr>
+      <w:tblGrid>
+        <w:gridCol w:w="10790"/>
+      </w:tblGrid>
+      <w:tr>
+        <w:tc>
+          <w:tcPr>
+            <w:tcW w:w="10790" w:type="dxa"/>
+          </w:tcPr>
+          <w:p>
+            <w:pPr>
+              <w:rPr>
+                <w:b/>
+                <w:bCs/>
+              </w:rPr>
+            </w:pPr>
+            <w:r>
+              <w:drawing>
+                <wp:anchor distT="0" distB="0" distL="114300" distR="114300" simplePos="0" relativeHeight="251658240" behindDoc="0" locked="0" layoutInCell="1" allowOverlap="1" wp14:anchorId="50EA871F" wp14:editId="0A029FA9">
+                  <wp:simplePos x="0" y="0"/>
+                  <wp:positionH relativeFrom="column">
+                    <wp:posOffset>4224020</wp:posOffset>
+                  </wp:positionH>
+                  <wp:positionV relativeFrom="paragraph">
+                    <wp:posOffset>72390</wp:posOffset>
+                  </wp:positionV>
+                  <wp:extent cx="2457450" cy="1308859"/>
+                  <wp:effectExtent l="0" t="0" r="0" b="5715"/>
+                  <wp:wrapThrough wrapText="bothSides">
+                    <wp:wrapPolygon edited="0">
+                      <wp:start x="0" y="0"/>
+                      <wp:lineTo x="0" y="21380"/>
+                      <wp:lineTo x="21433" y="21380"/>
+                      <wp:lineTo x="21433" y="0"/>
+                      <wp:lineTo x="0" y="0"/>
+                    </wp:wrapPolygon>
+                  </wp:wrapThrough>
+                  <wp:docPr id="1580020837" name="Picture 1"/>
+                  <wp:cNvGraphicFramePr>
+                    <a:graphicFrameLocks xmlns:a="http://schemas.openxmlformats.org/drawingml/2006/main" noChangeAspect="1"/>
+                  </wp:cNvGraphicFramePr>
+                  <a:graphic xmlns:a="http://schemas.openxmlformats.org/drawingml/2006/main">
+                    <a:graphicData uri="http://schemas.openxmlformats.org/drawingml/2006/picture">
+                      <pic:pic xmlns:pic="http://schemas.openxmlformats.org/drawingml/2006/picture">
+                        <pic:nvPicPr>
+                          <pic:cNvPr id="1580020837" name=""/>
+                          <pic:cNvPicPr/>
+                        </pic:nvPicPr>
+                        <pic:blipFill>
+                          <a:blip r:embed="rId14">
+                            <a:extLst>
+                              <a:ext uri="{28A0092B-C50C-407E-A947-70E740481C1C}">
+                                <a14:useLocalDpi xmlns:a14="http://schemas.microsoft.com/office/drawing/2010/main" val="0"/>
+                              </a:ext>
+                            </a:extLst>
+                          </a:blip>
+                          <a:stretch>
+                            <a:fillRect/>
+                          </a:stretch>
+                        </pic:blipFill>
+                        <pic:spPr>
+                          <a:xfrm>
+                            <a:off x="0" y="0"/>
+                            <a:ext cx="2457450" cy="1308859"/>
+                          </a:xfrm>
+                          <a:prstGeom prst="rect">
+                            <a:avLst/>
+                          </a:prstGeom>
+                        </pic:spPr>
+                      </pic:pic>
+                    </a:graphicData>
+                  </a:graphic>
+                </wp:anchor>
+              </w:drawing>
+            </w:r>
+            <w:r>
+              <w:rPr>
+                <w:b/>
+                <w:bCs/>
+              </w:rPr>
+              <w:t>Thread-Level Concurrency</w:t>
+            </w:r>
+          </w:p>
+          <w:p>
+            <w:r>
+              <w:t xml:space="preserve">Multiple control flows executed within a single process. </w:t>
+            </w:r>
+          </w:p>
+          <w:p>
+            <w:r>
+              <w:t>“Hiring multiple chefs, each with their own station, working on completely separate dishes simultaneously”</w:t>
+            </w:r>
+          </w:p>
+          <w:p/>
+          <w:p>
+            <w:r>
+              <w:rPr>
+                <w:b/>
+                <w:bCs/>
+              </w:rPr>
+              <w:t>Uniprocessors</w:t>
+            </w:r>
+            <w:r>
+              <w:t xml:space="preserve"> – Single processor; switching among multiple tasks</w:t>
+            </w:r>
+          </w:p>
+          <w:p>
+            <w:r>
+              <w:rPr>
+                <w:b/>
+                <w:bCs/>
+              </w:rPr>
+              <w:t>Multiprocessors</w:t>
+            </w:r>
+            <w:r>
+              <w:t xml:space="preserve"> – Multiple processors, under control of the OS kernel</w:t>
+            </w:r>
+          </w:p>
+          <w:p>
+            <w:pPr>
+              <w:pStyle w:val="ListParagraph"/>
+              <w:numPr>
+                <w:ilvl w:val="0"/>
+                <w:numId w:val="4"/>
+              </w:numPr>
+            </w:pPr>
+            <w:r>
+              <w:t>More commonplace with the advent of multi-core processors and hyperthreading</w:t>
+            </w:r>
+          </w:p>
+          <w:p/>
+          <w:p>
+            <w:pPr>
+              <w:rPr>
+                <w:noProof/>
+              </w:rPr>
+            </w:pPr>
+            <w:r>
+              <w:rPr>
+                <w:noProof/>
+              </w:rPr>
+              <w:t xml:space="preserve"> </w:t>
+            </w:r>
+            <w:r>
+              <w:rPr>
+                <w:noProof/>
+              </w:rPr>
+              <w:drawing>
+                <wp:inline distT="0" distB="0" distL="0" distR="0" wp14:anchorId="3258A92A" wp14:editId="04DA4C80">
+                  <wp:extent cx="3981450" cy="2326936"/>
+                  <wp:effectExtent l="0" t="0" r="0" b="0"/>
+                  <wp:docPr id="1441252267" name="Picture 1"/>
+                  <wp:cNvGraphicFramePr>
+                    <a:graphicFrameLocks xmlns:a="http://schemas.openxmlformats.org/drawingml/2006/main" noChangeAspect="1"/>
+                  </wp:cNvGraphicFramePr>
+                  <a:graphic xmlns:a="http://schemas.openxmlformats.org/drawingml/2006/main">
+                    <a:graphicData uri="http://schemas.openxmlformats.org/drawingml/2006/picture">
+                      <pic:pic xmlns:pic="http://schemas.openxmlformats.org/drawingml/2006/picture">
+                        <pic:nvPicPr>
+                          <pic:cNvPr id="1441252267" name=""/>
+                          <pic:cNvPicPr/>
+                        </pic:nvPicPr>
+                        <pic:blipFill>
+                          <a:blip r:embed="rId15"/>
+                          <a:stretch>
+                            <a:fillRect/>
+                          </a:stretch>
+                        </pic:blipFill>
+                        <pic:spPr>
+                          <a:xfrm>
+                            <a:off x="0" y="0"/>
+                            <a:ext cx="3991110" cy="2332582"/>
+                          </a:xfrm>
+                          <a:prstGeom prst="rect">
+                            <a:avLst/>
+                          </a:prstGeom>
+                        </pic:spPr>
+                      </pic:pic>
+                    </a:graphicData>
+                  </a:graphic>
+                </wp:inline>
+              </w:drawing>
+            </w:r>
+          </w:p>
+          <w:p>
+            <w:r>
+              <w:rPr>
+                <w:b/>
+                <w:bCs/>
+                <w:noProof/>
+              </w:rPr>
+              <w:t>Hyperthreading</w:t>
+            </w:r>
+            <w:r>
+              <w:rPr>
+                <w:noProof/>
+              </w:rPr>
+              <w:t xml:space="preserve"> allows a single CPU to execute multiple flows of control. It decides which of its threads to execute on a cycle-by-cycle basis. If one thread must wait for some data to be loaded into cache, it can proceed with the execution of a different thread.</w:t>
+            </w:r>
+          </w:p>
+          <w:p/>
+          <w:p/>
+          <w:p/>
+        </w:tc>
+      </w:tr>
+      <w:tr>
+        <w:tc>
+          <w:tcPr>
+            <w:tcW w:w="10790" w:type="dxa"/>
+          </w:tcPr>
+          <w:p>
+            <w:pPr>
+              <w:rPr>
+                <w:b/>
+                <w:bCs/>
+              </w:rPr>
+            </w:pPr>
+            <w:r>
+              <w:rPr>
+                <w:b/>
+                <w:bCs/>
+              </w:rPr>
+              <w:lastRenderedPageBreak/>
+              <w:t>Instruction-Level Parallelism</w:t>
+            </w:r>
+          </w:p>
+          <w:p>
+            <w:r>
+              <w:t xml:space="preserve">A processor </w:t>
+            </w:r>
+            <w:r>
+              <w:t xml:space="preserve">can execute multiple instructions at once. </w:t>
+            </w:r>
+          </w:p>
+          <w:p>
+            <w:r>
+              <w:t>“One chef working faster by prepping the garnish while the steak is cooking – multitasking within a single job”</w:t>
+            </w:r>
+          </w:p>
+          <w:p/>
+          <w:p>
+            <w:r>
+              <w:rPr>
+                <w:b/>
+                <w:bCs/>
+              </w:rPr>
+              <w:t>Pipelining</w:t>
+            </w:r>
+            <w:r>
+              <w:t xml:space="preserve"> – Actions required to execute an instruction are partitioned into different steps and organized as a series of stages. The stages can operate in parallel, working on different parts of different instructions.</w:t>
+            </w:r>
+          </w:p>
+          <w:p/>
+          <w:p>
+            <w:r>
+              <w:rPr>
+                <w:b/>
+                <w:bCs/>
+              </w:rPr>
+              <w:t>Superscalar Processors</w:t>
+            </w:r>
+            <w:r>
+              <w:t xml:space="preserve"> – Can sustain execution rates faster than 1 instruction per cycle</w:t>
+            </w:r>
+          </w:p>
+          <w:p/>
+        </w:tc>
+      </w:tr>
+      <w:tr>
+        <w:tc>
+          <w:tcPr>
+            <w:tcW w:w="10790" w:type="dxa"/>
+          </w:tcPr>
+          <w:p>
+            <w:pPr>
+              <w:rPr>
+                <w:b/>
+                <w:bCs/>
+              </w:rPr>
+            </w:pPr>
+            <w:r>
+              <w:rPr>
+                <w:b/>
+                <w:bCs/>
+              </w:rPr>
+              <w:t>Single-Instruction, Multiple-Data (SIMD) Parallelism</w:t>
+            </w:r>
+          </w:p>
+          <w:p>
+            <w:r>
+              <w:t>Allows a single instruction to cause multiple operations to be performed in parallel.</w:t>
+            </w:r>
+          </w:p>
+          <w:p/>
+          <w:p>
+            <w:r>
+              <w:t>Ex. Add 8 pairs of single-precision floating-point numbers in parallel.</w:t>
+            </w:r>
+          </w:p>
+          <w:p/>
+          <w:p>
+            <w:r>
+              <w:t>Mostly used to speed up applications that process image, sound, and video data.</w:t>
+            </w:r>
+          </w:p>
+        </w:tc>
+      </w:tr>
+    </w:tbl>
+    <w:p/>
+    <w:p>
+      <w:pPr>
+        <w:pStyle w:val="Heading1"/>
+      </w:pPr>
+      <w:r>
+        <w:t>Chapter 2: Representing and Manipulating Information</w:t>
+      </w:r>
+    </w:p>
+    <w:p>
+      <w:r>
+        <w:t>We have three representations of numbers:</w:t>
+      </w:r>
+    </w:p>
+    <w:tbl>
+      <w:tblPr>
+        <w:tblStyle w:val="TableGrid"/>
+        <w:tblW w:w="0" w:type="auto"/>
+        <w:tblLook w:val="04A0" w:firstRow="1" w:lastRow="0" w:firstColumn="1" w:lastColumn="0" w:noHBand="0" w:noVBand="1"/>
+      </w:tblPr>
+      <w:tblGrid>
+        <w:gridCol w:w="3325"/>
+        <w:gridCol w:w="7465"/>
+      </w:tblGrid>
+      <w:tr>
+        <w:tc>
+          <w:tcPr>
+            <w:tcW w:w="3325" w:type="dxa"/>
+          </w:tcPr>
+          <w:p>
+            <w:r>
+              <w:t>Unsigned</w:t>
+            </w:r>
+          </w:p>
+        </w:tc>
+        <w:tc>
+          <w:tcPr>
+            <w:tcW w:w="7465" w:type="dxa"/>
+          </w:tcPr>
+          <w:p>
+            <w:r>
+              <w:t>Representing numbers greater than or equal to 0</w:t>
+            </w:r>
+          </w:p>
+        </w:tc>
+      </w:tr>
+      <w:tr>
+        <w:tc>
+          <w:tcPr>
+            <w:tcW w:w="3325" w:type="dxa"/>
+          </w:tcPr>
+          <w:p>
+            <w:r>
+              <w:t>Two’s-complement</w:t>
+            </w:r>
+          </w:p>
+        </w:tc>
+        <w:tc>
+          <w:tcPr>
+            <w:tcW w:w="7465" w:type="dxa"/>
+          </w:tcPr>
+          <w:p>
+            <w:r>
+              <w:t>Signed; May be either positive or negative</w:t>
+            </w:r>
+          </w:p>
+        </w:tc>
+      </w:tr>
+      <w:tr>
+        <w:tc>
+          <w:tcPr>
+            <w:tcW w:w="3325" w:type="dxa"/>
+          </w:tcPr>
+          <w:p>
+            <w:r>
+              <w:t>Floating-point</w:t>
+            </w:r>
+          </w:p>
+        </w:tc>
+        <w:tc>
+          <w:tcPr>
+            <w:tcW w:w="7465" w:type="dxa"/>
+          </w:tcPr>
+          <w:p>
+            <w:r>
+              <w:t>Scientific notation for representing real numbers</w:t>
+            </w:r>
+          </w:p>
+        </w:tc>
+      </w:tr>
+    </w:tbl>
+    <w:p/>
+    <w:p>
+      <w:pPr>
+        <w:rPr>
+          <w:b/>
+          <w:bCs/>
+        </w:rPr>
+      </w:pPr>
+      <w:r>
+        <w:rPr>
+          <w:b/>
+          <w:bCs/>
+        </w:rPr>
+        <w:t>Sizes of basic C Data Types</w:t>
+      </w:r>
+    </w:p>
+    <w:p>
+      <w:pPr>
+        <w:rPr>
+          <w:b/>
+          <w:bCs/>
+        </w:rPr>
+      </w:pPr>
+      <w:r>
+        <w:rPr>
+          <w:b/>
+          <w:bCs/>
+        </w:rPr>
+        <w:drawing>
+          <wp:inline distT="0" distB="0" distL="0" distR="0" wp14:anchorId="10333296" wp14:editId="2F8FB225">
+            <wp:extent cx="6858000" cy="2978150"/>
+            <wp:effectExtent l="0" t="0" r="0" b="0"/>
+            <wp:docPr id="443271376" name="Picture 1"/>
+            <wp:cNvGraphicFramePr>
+              <a:graphicFrameLocks xmlns:a="http://schemas.openxmlformats.org/drawingml/2006/main" noChangeAspect="1"/>
+            </wp:cNvGraphicFramePr>
+            <a:graphic xmlns:a="http://schemas.openxmlformats.org/drawingml/2006/main">
+              <a:graphicData uri="http://schemas.openxmlformats.org/drawingml/2006/picture">
+                <pic:pic xmlns:pic="http://schemas.openxmlformats.org/drawingml/2006/picture">
+                  <pic:nvPicPr>
+                    <pic:cNvPr id="443271376" name=""/>
+                    <pic:cNvPicPr/>
+                  </pic:nvPicPr>
+                  <pic:blipFill>
+                    <a:blip r:embed="rId16"/>
+                    <a:stretch>
+                      <a:fillRect/>
+                    </a:stretch>
+                  </pic:blipFill>
+                  <pic:spPr>
+                    <a:xfrm>
+                      <a:off x="0" y="0"/>
+                      <a:ext cx="6858000" cy="2978150"/>
+                    </a:xfrm>
+                    <a:prstGeom prst="rect">
+                      <a:avLst/>
+                    </a:prstGeom>
+                  </pic:spPr>
+                </pic:pic>
+              </a:graphicData>
+            </a:graphic>
+          </wp:inline>
+        </w:drawing>
+      </w:r>
+    </w:p>
+    <w:p/>
+    <w:p>
+      <w:pPr>
+        <w:rPr>
+          <w:b/>
+          <w:bCs/>
+        </w:rPr>
+      </w:pPr>
+      <w:r>
+        <w:rPr>
+          <w:b/>
+          <w:bCs/>
+        </w:rPr>
+        <w:lastRenderedPageBreak/>
+        <w:t>Addressing and Byte Ordering</w:t>
+      </w:r>
+    </w:p>
+    <w:p>
+      <w:r>
+        <w:t>For program objects that span multiple bytes, we must establish two conventions:</w:t>
+      </w:r>
+    </w:p>
+    <w:p>
+      <w:pPr>
+        <w:pStyle w:val="ListParagraph"/>
+        <w:numPr>
+          <w:ilvl w:val="0"/>
+          <w:numId w:val="4"/>
+        </w:numPr>
+      </w:pPr>
+      <w:r>
+        <w:t>What the address of the object will be</w:t>
+      </w:r>
+    </w:p>
+    <w:p>
+      <w:pPr>
+        <w:pStyle w:val="ListParagraph"/>
+        <w:numPr>
+          <w:ilvl w:val="0"/>
+          <w:numId w:val="4"/>
+        </w:numPr>
+      </w:pPr>
+      <w:r>
+        <w:t>How we will order the bytes in memory</w:t>
+      </w:r>
+    </w:p>
+    <w:p>
+      <w:r>
+        <w:t xml:space="preserve">Let’s suppose a variable </w:t>
+      </w:r>
+      <w:r>
+        <w:rPr>
+          <w:i/>
+          <w:iCs/>
+        </w:rPr>
+        <w:t>x</w:t>
+      </w:r>
+      <w:r>
+        <w:t xml:space="preserve"> of type </w:t>
+      </w:r>
+      <w:r>
+        <w:rPr>
+          <w:i/>
+          <w:iCs/>
+        </w:rPr>
+        <w:t>int</w:t>
+      </w:r>
+      <w:r>
+        <w:t xml:space="preserve"> has address </w:t>
+      </w:r>
+      <w:r>
+        <w:rPr>
+          <w:i/>
+          <w:iCs/>
+        </w:rPr>
+        <w:t>0x100</w:t>
+      </w:r>
+      <w:r>
+        <w:t xml:space="preserve">. The 4 bytes of </w:t>
+      </w:r>
+      <w:r>
+        <w:rPr>
+          <w:i/>
+          <w:iCs/>
+        </w:rPr>
+        <w:t>x</w:t>
+      </w:r>
+      <w:r>
+        <w:t xml:space="preserve"> would be stored in memory locations 0x100, 0x101, 0x102, 0x103. </w:t>
+      </w:r>
+      <w:r>
+        <w:rPr>
+          <w:i/>
+          <w:iCs/>
+        </w:rPr>
+        <w:t>X</w:t>
+      </w:r>
+      <w:r>
+        <w:t xml:space="preserve"> has a hexadecimal value of </w:t>
+      </w:r>
+      <w:r>
+        <w:rPr>
+          <w:i/>
+          <w:iCs/>
+        </w:rPr>
+        <w:t>0x</w:t>
+      </w:r>
+      <w:r>
+        <w:rPr>
+          <w:i/>
+          <w:iCs/>
+          <w:color w:val="EE0000"/>
+        </w:rPr>
+        <w:t>01</w:t>
+      </w:r>
+      <w:r>
+        <w:rPr>
+          <w:i/>
+          <w:iCs/>
+        </w:rPr>
+        <w:t>2345</w:t>
+      </w:r>
+      <w:r>
+        <w:rPr>
+          <w:i/>
+          <w:iCs/>
+          <w:color w:val="00B050"/>
+        </w:rPr>
+        <w:t>67</w:t>
+      </w:r>
+      <w:r>
+        <w:t xml:space="preserve">. </w:t>
+      </w:r>
+    </w:p>
+    <w:p>
+      <w:r>
+        <w:rPr>
+          <w:b/>
+          <w:bCs/>
+        </w:rPr>
+        <w:t>Big-Endian</w:t>
+      </w:r>
+      <w:r>
+        <w:t xml:space="preserve"> chooses to store the </w:t>
+      </w:r>
+      <w:r>
+        <w:rPr>
+          <w:color w:val="EE0000"/>
+        </w:rPr>
+        <w:t xml:space="preserve">most significant byte </w:t>
+      </w:r>
+      <w:r>
+        <w:rPr>
+          <w:color w:val="EE0000"/>
+        </w:rPr>
+        <w:t xml:space="preserve">(High-Order) </w:t>
+      </w:r>
+      <w:r>
+        <w:t>first.</w:t>
+      </w:r>
+    </w:p>
+    <w:p>
+      <w:r>
+        <w:rPr>
+          <w:b/>
+          <w:bCs/>
+        </w:rPr>
+        <w:t>Little-Endian</w:t>
+      </w:r>
+      <w:r>
+        <w:t xml:space="preserve"> chooses to store the </w:t>
+      </w:r>
+      <w:r>
+        <w:rPr>
+          <w:color w:val="00B050"/>
+        </w:rPr>
+        <w:t>least significant byte</w:t>
+      </w:r>
+      <w:r>
+        <w:rPr>
+          <w:color w:val="00B050"/>
+        </w:rPr>
+        <w:t xml:space="preserve"> (Low-Order)</w:t>
+      </w:r>
+      <w:r>
+        <w:rPr>
+          <w:color w:val="00B050"/>
+        </w:rPr>
+        <w:t xml:space="preserve"> </w:t>
+      </w:r>
+      <w:r>
+        <w:t>first.</w:t>
+      </w:r>
+    </w:p>
+    <w:p>
+      <w:r>
+        <w:drawing>
+          <wp:inline distT="0" distB="0" distL="0" distR="0" wp14:anchorId="3449D1A6" wp14:editId="49215687">
+            <wp:extent cx="5133975" cy="1880551"/>
+            <wp:effectExtent l="0" t="0" r="0" b="5715"/>
+            <wp:docPr id="1619997603" name="Picture 1"/>
+            <wp:cNvGraphicFramePr>
+              <a:graphicFrameLocks xmlns:a="http://schemas.openxmlformats.org/drawingml/2006/main" noChangeAspect="1"/>
+            </wp:cNvGraphicFramePr>
+            <a:graphic xmlns:a="http://schemas.openxmlformats.org/drawingml/2006/main">
+              <a:graphicData uri="http://schemas.openxmlformats.org/drawingml/2006/picture">
+                <pic:pic xmlns:pic="http://schemas.openxmlformats.org/drawingml/2006/picture">
+                  <pic:nvPicPr>
+                    <pic:cNvPr id="1619997603" name=""/>
+                    <pic:cNvPicPr/>
+                  </pic:nvPicPr>
+                  <pic:blipFill>
+                    <a:blip r:embed="rId17"/>
+                    <a:stretch>
+                      <a:fillRect/>
+                    </a:stretch>
+                  </pic:blipFill>
+                  <pic:spPr>
+                    <a:xfrm>
+                      <a:off x="0" y="0"/>
+                      <a:ext cx="5146991" cy="1885319"/>
+                    </a:xfrm>
+                    <a:prstGeom prst="rect">
+                      <a:avLst/>
+                    </a:prstGeom>
+                  </pic:spPr>
+                </pic:pic>
+              </a:graphicData>
+            </a:graphic>
+          </wp:inline>
+        </w:drawing>
+      </w:r>
+    </w:p>
+    <w:p/>
+    <w:p/>
+    <w:p/>
+    <w:p/>
+    <w:p/>
+    <w:p/>
+    <w:p/>
+    <w:p/>
     <w:sectPr>
       <w:pgSz w:w="12240" w:h="15840"/>
       <w:pgMar w:top="720" w:right="720" w:bottom="720" w:left="720" w:header="720" w:footer="720" w:gutter="0"/>
@@ -1201,9 +2194,9 @@
 <file path=word/numbering.xml><?xml version="1.0" encoding="utf-8"?>
 <w:numbering xmlns:wpc="http://schemas.microsoft.com/office/word/2010/wordprocessingCanvas" xmlns:cx="http://schemas.microsoft.com/office/drawing/2014/chartex" xmlns:cx1="http://schemas.microsoft.com/office/drawing/2015/9/8/chartex" xmlns:cx2="http://schemas.microsoft.com/office/drawing/2015/10/21/chartex" xmlns:cx3="http://schemas.microsoft.com/office/drawing/2016/5/9/chartex" xmlns:cx4="http://schemas.microsoft.com/office/drawing/2016/5/10/chartex" xmlns:cx5="http://schemas.microsoft.com/office/drawing/2016/5/11/chartex" xmlns:cx6="http://schemas.microsoft.com/office/drawing/2016/5/12/chartex" xmlns:cx7="http://schemas.microsoft.com/office/drawing/2016/5/13/chartex" xmlns:cx8="http://schemas.microsoft.com/office/drawing/2016/5/14/chartex" xmlns:mc="http://schemas.openxmlformats.org/markup-compatibility/2006" xmlns:aink="http://schemas.microsoft.com/office/drawing/2016/ink" xmlns:am3d="http://schemas.microsoft.com/office/drawing/2017/model3d" xmlns:o="urn:schemas-microsoft-com:office:office" xmlns:oel="http://schemas.microsoft.com/office/2019/extlst" xmlns:r="http://schemas.openxmlformats.org/officeDocument/2006/relationships" xmlns:m="http://schemas.openxmlformats.org/officeDocument/2006/math" xmlns:v="urn:schemas-microsoft-com:vml" xmlns:wp14="http://schemas.microsoft.com/office/word/2010/wordprocessingDrawing" xmlns:wp="http://schemas.openxmlformats.org/drawingml/2006/wordprocessingDrawing" xmlns:w10="urn:schemas-microsoft-com:office:word" xmlns:w="http://schemas.openxmlformats.org/wordprocessingml/2006/main" xmlns:w14="http://schemas.microsoft.com/office/word/2010/wordml" xmlns:w15="http://schemas.microsoft.com/office/word/2012/wordml" xmlns:w16cex="http://schemas.microsoft.com/office/word/2018/wordml/cex" xmlns:w16cid="http://schemas.microsoft.com/office/word/2016/wordml/cid" xmlns:w16="http://schemas.microsoft.com/office/word/2018/wordml" xmlns:w16du="http://schemas.microsoft.com/office/word/2023/wordml/word16du" xmlns:w16sdtdh="http://schemas.microsoft.com/office/word/2020/wordml/sdtdatahash" xmlns:w16sdtfl="http://schemas.microsoft.com/office/word/2024/wordml/sdtformatlock" xmlns:w16se="http://schemas.microsoft.com/office/word/2015/wordml/symex" xmlns:wpg="http://schemas.microsoft.com/office/word/2010/wordprocessingGroup" xmlns:wpi="http://schemas.microsoft.com/office/word/2010/wordprocessingInk" xmlns:wne="http://schemas.microsoft.com/office/word/2006/wordml" xmlns:wps="http://schemas.microsoft.com/office/word/2010/wordprocessingShape" mc:Ignorable="w14 w15 w16se w16cid w16 w16cex w16sdtdh w16sdtfl w16du wp14">
   <w:abstractNum w:abstractNumId="0" w15:restartNumberingAfterBreak="0">
-    <w:nsid w:val="178E52CB"/>
+    <w:nsid w:val="010E118E"/>
     <w:multiLevelType w:val="hybridMultilevel"/>
-    <w:tmpl w:val="D65658AA"/>
+    <w:tmpl w:val="71A08664"/>
     <w:lvl w:ilvl="0" w:tplc="04090001">
       <w:start w:val="1"/>
       <w:numFmt w:val="bullet"/>
@@ -1314,9 +2307,9 @@
     </w:lvl>
   </w:abstractNum>
   <w:abstractNum w:abstractNumId="1" w15:restartNumberingAfterBreak="0">
-    <w:nsid w:val="180A745D"/>
+    <w:nsid w:val="178E52CB"/>
     <w:multiLevelType w:val="hybridMultilevel"/>
-    <w:tmpl w:val="D71E4AAE"/>
+    <w:tmpl w:val="D65658AA"/>
     <w:lvl w:ilvl="0" w:tplc="04090001">
       <w:start w:val="1"/>
       <w:numFmt w:val="bullet"/>
@@ -1427,6 +2420,119 @@
     </w:lvl>
   </w:abstractNum>
   <w:abstractNum w:abstractNumId="2" w15:restartNumberingAfterBreak="0">
+    <w:nsid w:val="180A745D"/>
+    <w:multiLevelType w:val="hybridMultilevel"/>
+    <w:tmpl w:val="D71E4AAE"/>
+    <w:lvl w:ilvl="0" w:tplc="04090001">
+      <w:start w:val="1"/>
+      <w:numFmt w:val="bullet"/>
+      <w:lvlText w:val=""/>
+      <w:lvlJc w:val="left"/>
+      <w:pPr>
+        <w:ind w:left="720" w:hanging="360"/>
+      </w:pPr>
+      <w:rPr>
+        <w:rFonts w:ascii="Symbol" w:hAnsi="Symbol" w:hint="default"/>
+      </w:rPr>
+    </w:lvl>
+    <w:lvl w:ilvl="1" w:tplc="04090003" w:tentative="1">
+      <w:start w:val="1"/>
+      <w:numFmt w:val="bullet"/>
+      <w:lvlText w:val="o"/>
+      <w:lvlJc w:val="left"/>
+      <w:pPr>
+        <w:ind w:left="1440" w:hanging="360"/>
+      </w:pPr>
+      <w:rPr>
+        <w:rFonts w:ascii="Courier New" w:hAnsi="Courier New" w:cs="Courier New" w:hint="default"/>
+      </w:rPr>
+    </w:lvl>
+    <w:lvl w:ilvl="2" w:tplc="04090005" w:tentative="1">
+      <w:start w:val="1"/>
+      <w:numFmt w:val="bullet"/>
+      <w:lvlText w:val=""/>
+      <w:lvlJc w:val="left"/>
+      <w:pPr>
+        <w:ind w:left="2160" w:hanging="360"/>
+      </w:pPr>
+      <w:rPr>
+        <w:rFonts w:ascii="Wingdings" w:hAnsi="Wingdings" w:hint="default"/>
+      </w:rPr>
+    </w:lvl>
+    <w:lvl w:ilvl="3" w:tplc="04090001" w:tentative="1">
+      <w:start w:val="1"/>
+      <w:numFmt w:val="bullet"/>
+      <w:lvlText w:val=""/>
+      <w:lvlJc w:val="left"/>
+      <w:pPr>
+        <w:ind w:left="2880" w:hanging="360"/>
+      </w:pPr>
+      <w:rPr>
+        <w:rFonts w:ascii="Symbol" w:hAnsi="Symbol" w:hint="default"/>
+      </w:rPr>
+    </w:lvl>
+    <w:lvl w:ilvl="4" w:tplc="04090003" w:tentative="1">
+      <w:start w:val="1"/>
+      <w:numFmt w:val="bullet"/>
+      <w:lvlText w:val="o"/>
+      <w:lvlJc w:val="left"/>
+      <w:pPr>
+        <w:ind w:left="3600" w:hanging="360"/>
+      </w:pPr>
+      <w:rPr>
+        <w:rFonts w:ascii="Courier New" w:hAnsi="Courier New" w:cs="Courier New" w:hint="default"/>
+      </w:rPr>
+    </w:lvl>
+    <w:lvl w:ilvl="5" w:tplc="04090005" w:tentative="1">
+      <w:start w:val="1"/>
+      <w:numFmt w:val="bullet"/>
+      <w:lvlText w:val=""/>
+      <w:lvlJc w:val="left"/>
+      <w:pPr>
+        <w:ind w:left="4320" w:hanging="360"/>
+      </w:pPr>
+      <w:rPr>
+        <w:rFonts w:ascii="Wingdings" w:hAnsi="Wingdings" w:hint="default"/>
+      </w:rPr>
+    </w:lvl>
+    <w:lvl w:ilvl="6" w:tplc="04090001" w:tentative="1">
+      <w:start w:val="1"/>
+      <w:numFmt w:val="bullet"/>
+      <w:lvlText w:val=""/>
+      <w:lvlJc w:val="left"/>
+      <w:pPr>
+        <w:ind w:left="5040" w:hanging="360"/>
+      </w:pPr>
+      <w:rPr>
+        <w:rFonts w:ascii="Symbol" w:hAnsi="Symbol" w:hint="default"/>
+      </w:rPr>
+    </w:lvl>
+    <w:lvl w:ilvl="7" w:tplc="04090003" w:tentative="1">
+      <w:start w:val="1"/>
+      <w:numFmt w:val="bullet"/>
+      <w:lvlText w:val="o"/>
+      <w:lvlJc w:val="left"/>
+      <w:pPr>
+        <w:ind w:left="5760" w:hanging="360"/>
+      </w:pPr>
+      <w:rPr>
+        <w:rFonts w:ascii="Courier New" w:hAnsi="Courier New" w:cs="Courier New" w:hint="default"/>
+      </w:rPr>
+    </w:lvl>
+    <w:lvl w:ilvl="8" w:tplc="04090005" w:tentative="1">
+      <w:start w:val="1"/>
+      <w:numFmt w:val="bullet"/>
+      <w:lvlText w:val=""/>
+      <w:lvlJc w:val="left"/>
+      <w:pPr>
+        <w:ind w:left="6480" w:hanging="360"/>
+      </w:pPr>
+      <w:rPr>
+        <w:rFonts w:ascii="Wingdings" w:hAnsi="Wingdings" w:hint="default"/>
+      </w:rPr>
+    </w:lvl>
+  </w:abstractNum>
+  <w:abstractNum w:abstractNumId="3" w15:restartNumberingAfterBreak="0">
     <w:nsid w:val="7EC76280"/>
     <w:multiLevelType w:val="hybridMultilevel"/>
     <w:tmpl w:val="1F72DDF4"/>
@@ -1513,13 +2619,16 @@
     </w:lvl>
   </w:abstractNum>
   <w:num w:numId="1" w16cid:durableId="325593781">
+    <w:abstractNumId w:val="2"/>
+  </w:num>
+  <w:num w:numId="2" w16cid:durableId="80681632">
     <w:abstractNumId w:val="1"/>
   </w:num>
-  <w:num w:numId="2" w16cid:durableId="80681632">
+  <w:num w:numId="3" w16cid:durableId="327100261">
+    <w:abstractNumId w:val="3"/>
+  </w:num>
+  <w:num w:numId="4" w16cid:durableId="1046099847">
     <w:abstractNumId w:val="0"/>
-  </w:num>
-  <w:num w:numId="3" w16cid:durableId="327100261">
-    <w:abstractNumId w:val="2"/>
   </w:num>
 </w:numbering>
 </file>
@@ -2126,7 +3235,6 @@
   <w:style w:type="character" w:default="1" w:styleId="DefaultParagraphFont">
     <w:name w:val="Default Paragraph Font"/>
     <w:uiPriority w:val="1"/>
-    <w:semiHidden/>
     <w:unhideWhenUsed/>
   </w:style>
   <w:style w:type="table" w:default="1" w:styleId="TableNormal">

</xml_diff>

<commit_message>
Add byte representation program CS:APP Figure 2.4 and updated notes
</commit_message>
<xml_diff>
--- a/notes.docx
+++ b/notes.docx
@@ -1412,19 +1412,7 @@
     </w:p>
     <w:p>
       <w:r>
-        <w:t xml:space="preserve">We demand computers </w:t>
-      </w:r>
-      <w:r>
-        <w:t>do</w:t>
-      </w:r>
-      <w:r>
-        <w:t xml:space="preserve"> more, and we want them to run faster. </w:t>
-      </w:r>
-      <w:r>
-        <w:t>Both</w:t>
-      </w:r>
-      <w:r>
-        <w:t xml:space="preserve"> factors improve when the processor does more things at once. We use the term </w:t>
+        <w:t xml:space="preserve">We demand computers do more, and we want them to run faster. Both factors improve when the processor does more things at once. We use the term </w:t>
       </w:r>
       <w:r>
         <w:rPr>
@@ -1493,6 +1481,9 @@
               </w:rPr>
             </w:pPr>
             <w:r>
+              <w:rPr>
+                <w:noProof/>
+              </w:rPr>
               <w:drawing>
                 <wp:anchor distT="0" distB="0" distL="114300" distR="114300" simplePos="0" relativeHeight="251658240" behindDoc="0" locked="0" layoutInCell="1" allowOverlap="1" wp14:anchorId="50EA871F" wp14:editId="0A029FA9">
                   <wp:simplePos x="0" y="0"/>
@@ -1902,6 +1893,7 @@
         <w:rPr>
           <w:b/>
           <w:bCs/>
+          <w:noProof/>
         </w:rPr>
         <w:drawing>
           <wp:inline distT="0" distB="0" distL="0" distR="0" wp14:anchorId="10333296" wp14:editId="2F8FB225">
@@ -2136,6 +2128,9 @@
     </w:p>
     <w:p>
       <w:r>
+        <w:rPr>
+          <w:noProof/>
+        </w:rPr>
         <w:drawing>
           <wp:inline distT="0" distB="0" distL="0" distR="0" wp14:anchorId="3449D1A6" wp14:editId="49215687">
             <wp:extent cx="5133975" cy="1880551"/>
@@ -2174,7 +2169,60 @@
       </w:r>
     </w:p>
     <w:p/>
-    <w:p/>
+    <w:p>
+      <w:pPr>
+        <w:rPr>
+          <w:b/>
+          <w:bCs/>
+        </w:rPr>
+      </w:pPr>
+      <w:r>
+        <w:rPr>
+          <w:b/>
+          <w:bCs/>
+        </w:rPr>
+        <w:t>Shift Operations</w:t>
+      </w:r>
+    </w:p>
+    <w:p>
+      <w:r>
+        <w:drawing>
+          <wp:inline distT="0" distB="0" distL="0" distR="0" wp14:anchorId="7FD48072" wp14:editId="70D51D12">
+            <wp:extent cx="6858000" cy="2449830"/>
+            <wp:effectExtent l="0" t="0" r="0" b="7620"/>
+            <wp:docPr id="1214429104" name="Picture 1"/>
+            <wp:cNvGraphicFramePr>
+              <a:graphicFrameLocks xmlns:a="http://schemas.openxmlformats.org/drawingml/2006/main" noChangeAspect="1"/>
+            </wp:cNvGraphicFramePr>
+            <a:graphic xmlns:a="http://schemas.openxmlformats.org/drawingml/2006/main">
+              <a:graphicData uri="http://schemas.openxmlformats.org/drawingml/2006/picture">
+                <pic:pic xmlns:pic="http://schemas.openxmlformats.org/drawingml/2006/picture">
+                  <pic:nvPicPr>
+                    <pic:cNvPr id="1214429104" name=""/>
+                    <pic:cNvPicPr/>
+                  </pic:nvPicPr>
+                  <pic:blipFill>
+                    <a:blip r:embed="rId18"/>
+                    <a:stretch>
+                      <a:fillRect/>
+                    </a:stretch>
+                  </pic:blipFill>
+                  <pic:spPr>
+                    <a:xfrm>
+                      <a:off x="0" y="0"/>
+                      <a:ext cx="6858000" cy="2449830"/>
+                    </a:xfrm>
+                    <a:prstGeom prst="rect">
+                      <a:avLst/>
+                    </a:prstGeom>
+                  </pic:spPr>
+                </pic:pic>
+              </a:graphicData>
+            </a:graphic>
+          </wp:inline>
+        </w:drawing>
+      </w:r>
+    </w:p>
     <w:p/>
     <w:p/>
     <w:p/>
@@ -3235,6 +3283,7 @@
   <w:style w:type="character" w:default="1" w:styleId="DefaultParagraphFont">
     <w:name w:val="Default Paragraph Font"/>
     <w:uiPriority w:val="1"/>
+    <w:semiHidden/>
     <w:unhideWhenUsed/>
   </w:style>
   <w:style w:type="table" w:default="1" w:styleId="TableNormal">

</xml_diff>